<commit_message>
update manuscript files with revisions and highlighted changes for ML disclosure
</commit_message>
<xml_diff>
--- a/manuscript/cs-2026-03505f_Response_to_Reviewer_ML_Disclosure.docx
+++ b/manuscript/cs-2026-03505f_Response_to_Reviewer_ML_Disclosure.docx
@@ -1966,30 +1966,44 @@
           <w:rFonts w:ascii="Times New Roman" w:hAnsi="Times New Roman"/>
           <w:b/>
           <w:color w:val="00B0F0"/>
-          <w:sz w:val="24"/>
+        </w:rPr>
+        <w:t xml:space="preserve">Response: </w:t>
+      </w:r>
+      <w:r>
+        <w:rPr>
+          <w:rFonts w:ascii="Times New Roman" w:hAnsi="Times New Roman"/>
+          <w:color w:val="00B0F0"/>
           <w:highlight w:val="yellow"/>
         </w:rPr>
-        <w:t xml:space="preserve">Response: </w:t>
-      </w:r>
+        <w:t>We agree with the reviewer and have revised the manuscript and Supporting Information to present the machine learning analysis more cautiously. The complete dataset used for both targets has been added as Table S3 in the Supporting Information. It contains all 23 experimental records, the four input variables (average pore size, PTFE amount, catalyst loading, and Mo content), and the corresponding values for Faradaic efficiency and NH₃ yield.</w:t>
+      </w:r>
+    </w:p>
+    <w:p>
+      <w:pPr>
+        <w:rPr>
+          <w:rFonts w:ascii="Times New Roman" w:eastAsia="Microsoft YaHei UI" w:hAnsi="Times New Roman" w:cs="Times New Roman"/>
+          <w:color w:val="00B0F0"/>
+          <w:sz w:val="24"/>
+          <w:szCs w:val="24"/>
+          <w:shd w:val="clear" w:color="auto" w:fill="FAFAFA"/>
+        </w:rPr>
+      </w:pPr>
       <w:r>
         <w:rPr>
           <w:rFonts w:ascii="Times New Roman" w:hAnsi="Times New Roman"/>
           <w:b w:val="0"/>
           <w:color w:val="00B0F0"/>
-          <w:sz w:val="24"/>
           <w:highlight w:val="yellow"/>
         </w:rPr>
-        <w:t>We agree with the reviewer and have revised the manuscript and Supporting Information to present the machine-learning analysis more cautiously. The complete dataset used for both targets has now been added as Table S3 in the Supporting Information. It contains all 23 experimental records, including the four input variables (average pore size, PTFE amount, catalyst loading, and Mo content) and the corresponding Faradaic-efficiency and NH₃-yield values.</w:t>
-      </w:r>
-    </w:p>
-    <w:p>
-      <w:pPr>
-        <w:rPr>
-          <w:rFonts w:ascii="Times New Roman" w:eastAsia="Microsoft YaHei UI" w:hAnsi="Times New Roman" w:cs="Times New Roman"/>
-          <w:color w:val="00B0F0"/>
-          <w:sz w:val="24"/>
-          <w:szCs w:val="24"/>
-          <w:shd w:val="clear" w:color="auto" w:fill="FAFAFA"/>
+        <w:t>We also added a complete description of the fitting and evaluation procedure. The two original XGBoost models used fixed hyperparameters of 300 trees, a learning rate of 0.05, a maximum depth of 6, a subsample ratio of 0.8, and a column subsample ratio of 0.8. The random seed was 42. Each model was fitted to all 23 data points. We did not use a train/test split, k fold cross validation, repeated cross validation, an independent test set, or hyperparameter optimization. The reported statistics therefore describe fit to the complete training dataset and are not validation results. For Faradaic efficiency, Table S4 reports R² = 1.000, RMSE ≈ 0.090 percentage points, and MAE = 0.069 percentage points. For NH₃ yield, it reports R² = 1.000, RMSE ≈ 0.235 µg h⁻¹ mg⁻¹, and MAE = 0.180 µg h⁻¹ mg⁻¹. The caption of Figure S24 now identifies the plotted values as fits to the training data.</w:t>
+      </w:r>
+    </w:p>
+    <w:p>
+      <w:pPr>
+        <w:rPr>
+          <w:rFonts w:ascii="Times New Roman" w:hAnsi="Times New Roman" w:cs="Times New Roman"/>
+          <w:sz w:val="24"/>
+          <w:szCs w:val="24"/>
         </w:rPr>
       </w:pPr>
       <w:r>
@@ -1997,29 +2011,9 @@
           <w:rFonts w:ascii="Times New Roman" w:hAnsi="Times New Roman"/>
           <w:b w:val="0"/>
           <w:color w:val="00B0F0"/>
-          <w:sz w:val="24"/>
           <w:highlight w:val="yellow"/>
         </w:rPr>
-        <w:t>We have also added the complete fitting and evaluation procedure. The two original XGBoost regressors used fixed hyperparameters (300 trees, learning rate 0.05, maximum depth 6, subsample 0.8, column subsample 0.8) and random seed 42. Each model was fitted to all 23 data points. No train/test split, k-fold or repeated cross-validation, independent test set, or hyperparameter optimization was used. We now state explicitly that the reported statistics are full-data, in-sample training-fit metrics rather than validation results. Table S4 reports, for Faradaic efficiency, R² = 1.000, RMSE ≈ 0.090 percentage points, and MAE = 0.069 percentage points; for NH₃ yield, R² = 1.000, RMSE ≈ 0.235 µg h⁻¹ mg⁻¹, and MAE = 0.180 µg h⁻¹ mg⁻¹. The caption of Figure S24 has also been revised to identify the plotted values as in-sample fits.</w:t>
-      </w:r>
-    </w:p>
-    <w:p>
-      <w:pPr>
-        <w:rPr>
-          <w:rFonts w:ascii="Times New Roman" w:hAnsi="Times New Roman" w:cs="Times New Roman"/>
-          <w:sz w:val="24"/>
-          <w:szCs w:val="24"/>
-        </w:rPr>
-      </w:pPr>
-      <w:r>
-        <w:rPr>
-          <w:rFonts w:ascii="Times New Roman" w:hAnsi="Times New Roman"/>
-          <w:b w:val="0"/>
-          <w:color w:val="00B0F0"/>
-          <w:sz w:val="24"/>
-          <w:highlight w:val="yellow"/>
-        </w:rPr>
-        <w:t>Finally, we revised the Abstract, Machine Learning methods, Results and Discussion, Figure 5 caption, and Conclusions. The XGBoost and SHAP results are now described as trends specific to the sampled ranges in this dataset, not as causal evidence or universal design principles. We explicitly acknowledge the limitations arising from the small dataset (n = 23), the use of only four controlled variables, repeated measurements at one nominal baseline condition, the one-variable-at-a-time sampling structure, and the absence of held-out or external validation. All corresponding additions and revisions are highlighted in yellow.</w:t>
+        <w:t>We revised the Abstract, Machine Learning methods, Results and Discussion, Figure 5 caption, and Conclusions. The XGBoost and SHAP results are now described as trends within this dataset and the sampled ranges. They are not presented as causal evidence or universal design principles. The revised text states the limitations of the small dataset, the use of only four controlled variables, the sampling structure in which one variable was changed at a time, and the absence of independent or external validation. All corresponding additions and revisions are highlighted in yellow.</w:t>
       </w:r>
     </w:p>
     <w:p>

</xml_diff>